<commit_message>
Se terminan los filtros y agrego Toastify JS
</commit_message>
<xml_diff>
--- a/entrega final.docx
+++ b/entrega final.docx
@@ -12,62 +12,13 @@
         <w:rPr>
           <w:lang w:val="en-US"/>
         </w:rPr>
-        <w:t xml:space="preserve">* </w:t>
-      </w:r>
-      <w:proofErr w:type="spellStart"/>
+        <w:t>*</w:t>
+      </w:r>
       <w:r>
         <w:rPr>
           <w:lang w:val="en-US"/>
         </w:rPr>
-        <w:t>Uso</w:t>
-      </w:r>
-      <w:proofErr w:type="spellEnd"/>
-      <w:r>
-        <w:rPr>
-          <w:lang w:val="en-US"/>
-        </w:rPr>
-        <w:t xml:space="preserve"> </w:t>
-      </w:r>
-      <w:proofErr w:type="spellStart"/>
-      <w:r>
-        <w:rPr>
-          <w:lang w:val="en-US"/>
-        </w:rPr>
-        <w:t>librería</w:t>
-      </w:r>
-      <w:proofErr w:type="spellEnd"/>
-      <w:r>
-        <w:rPr>
-          <w:lang w:val="en-US"/>
-        </w:rPr>
-        <w:t xml:space="preserve"> (</w:t>
-      </w:r>
-      <w:proofErr w:type="spellStart"/>
-      <w:r>
-        <w:rPr>
-          <w:lang w:val="en-US"/>
-        </w:rPr>
-        <w:t>toastify</w:t>
-      </w:r>
-      <w:proofErr w:type="spellEnd"/>
-      <w:r>
-        <w:rPr>
-          <w:lang w:val="en-US"/>
-        </w:rPr>
-        <w:t>)</w:t>
-      </w:r>
-    </w:p>
-    <w:p>
-      <w:pPr>
-        <w:rPr>
-          <w:lang w:val="en-US"/>
-        </w:rPr>
-      </w:pPr>
-      <w:r>
-        <w:rPr>
-          <w:lang w:val="en-US"/>
-        </w:rPr>
-        <w:t xml:space="preserve">* Fetch (try, catch, finally), </w:t>
+        <w:t xml:space="preserve"> Fetch (try, catch, finally), </w:t>
       </w:r>
       <w:proofErr w:type="spellStart"/>
       <w:proofErr w:type="gramStart"/>

</xml_diff>

<commit_message>
Completada la lógica del checkout
</commit_message>
<xml_diff>
--- a/entrega final.docx
+++ b/entrega final.docx
@@ -3,11 +3,6 @@
 <w:document xmlns:wpc="http://schemas.microsoft.com/office/word/2010/wordprocessingCanvas" xmlns:cx="http://schemas.microsoft.com/office/drawing/2014/chartex" xmlns:cx1="http://schemas.microsoft.com/office/drawing/2015/9/8/chartex" xmlns:cx2="http://schemas.microsoft.com/office/drawing/2015/10/21/chartex" xmlns:cx3="http://schemas.microsoft.com/office/drawing/2016/5/9/chartex" xmlns:cx4="http://schemas.microsoft.com/office/drawing/2016/5/10/chartex" xmlns:cx5="http://schemas.microsoft.com/office/drawing/2016/5/11/chartex" xmlns:cx6="http://schemas.microsoft.com/office/drawing/2016/5/12/chartex" xmlns:cx7="http://schemas.microsoft.com/office/drawing/2016/5/13/chartex" xmlns:cx8="http://schemas.microsoft.com/office/drawing/2016/5/14/chartex" xmlns:mc="http://schemas.openxmlformats.org/markup-compatibility/2006" xmlns:aink="http://schemas.microsoft.com/office/drawing/2016/ink" xmlns:am3d="http://schemas.microsoft.com/office/drawing/2017/model3d" xmlns:o="urn:schemas-microsoft-com:office:office" xmlns:r="http://schemas.openxmlformats.org/officeDocument/2006/relationships" xmlns:m="http://schemas.openxmlformats.org/officeDocument/2006/math" xmlns:v="urn:schemas-microsoft-com:vml" xmlns:wp14="http://schemas.microsoft.com/office/word/2010/wordprocessingDrawing" xmlns:wp="http://schemas.openxmlformats.org/drawingml/2006/wordprocessingDrawing" xmlns:w10="urn:schemas-microsoft-com:office:word" xmlns:w="http://schemas.openxmlformats.org/wordprocessingml/2006/main" xmlns:w14="http://schemas.microsoft.com/office/word/2010/wordml" xmlns:w15="http://schemas.microsoft.com/office/word/2012/wordml" xmlns:w16cid="http://schemas.microsoft.com/office/word/2016/wordml/cid" xmlns:w16se="http://schemas.microsoft.com/office/word/2015/wordml/symex" xmlns:wpg="http://schemas.microsoft.com/office/word/2010/wordprocessingGroup" xmlns:wpi="http://schemas.microsoft.com/office/word/2010/wordprocessingInk" xmlns:wne="http://schemas.microsoft.com/office/word/2006/wordml" xmlns:wps="http://schemas.microsoft.com/office/word/2010/wordprocessingShape" mc:Ignorable="w14 w15 w16se w16cid wp14">
   <w:body>
     <w:p>
-      <w:pPr>
-        <w:rPr>
-          <w:lang w:val="en-US"/>
-        </w:rPr>
-      </w:pPr>
       <w:r>
         <w:rPr>
           <w:lang w:val="en-US"/>
@@ -35,29 +30,11 @@
         </w:rPr>
         <w:t xml:space="preserve"> .JSON</w:t>
       </w:r>
+      <w:bookmarkStart w:id="0" w:name="_GoBack"/>
+      <w:bookmarkEnd w:id="0"/>
       <w:proofErr w:type="gramEnd"/>
     </w:p>
-    <w:p>
-      <w:r>
-        <w:t>* Método de pago</w:t>
-      </w:r>
-      <w:r>
-        <w:t>/formulario de datos de pago</w:t>
-      </w:r>
-      <w:r>
-        <w:t xml:space="preserve"> complete cuando c</w:t>
-      </w:r>
-      <w:r>
-        <w:t>ompra los productos</w:t>
-      </w:r>
-    </w:p>
-    <w:p>
-      <w:r>
-        <w:t>* Comprobante de pago con toda la info del usuario</w:t>
-      </w:r>
-      <w:bookmarkStart w:id="0" w:name="_GoBack"/>
-      <w:bookmarkEnd w:id="0"/>
-    </w:p>
+    <w:p/>
     <w:sectPr>
       <w:pgSz w:w="12240" w:h="15840"/>
       <w:pgMar w:top="1417" w:right="1701" w:bottom="1417" w:left="1701" w:header="708" w:footer="708" w:gutter="0"/>

</xml_diff>